<commit_message>
data infrastructure set up
</commit_message>
<xml_diff>
--- a/Thesis Paper.docx
+++ b/Thesis Paper.docx
@@ -254,6 +254,746 @@
         <w:t>Change management approaches for introducing autonomous dealer engagement systems?</w:t>
       </w:r>
     </w:p>
+    <w:p/>
+    <w:p>
+      <w:pPr>
+        <w:spacing w:before="100" w:beforeAutospacing="1" w:after="100" w:afterAutospacing="1" w:line="240" w:lineRule="auto"/>
+        <w:outlineLvl w:val="1"/>
+        <w:rPr>
+          <w:rFonts w:ascii="Times New Roman" w:eastAsia="Times New Roman" w:hAnsi="Times New Roman" w:cs="Times New Roman"/>
+          <w:b/>
+          <w:bCs/>
+          <w:sz w:val="36"/>
+          <w:szCs w:val="36"/>
+        </w:rPr>
+      </w:pPr>
+      <w:r>
+        <w:rPr>
+          <w:rFonts w:ascii="Times New Roman" w:eastAsia="Times New Roman" w:hAnsi="Times New Roman" w:cs="Times New Roman"/>
+          <w:b/>
+          <w:bCs/>
+          <w:sz w:val="36"/>
+          <w:szCs w:val="36"/>
+        </w:rPr>
+        <w:t>1. Where the “Data Infrastructure Setup” section should go</w:t>
+      </w:r>
+    </w:p>
+    <w:p>
+      <w:pPr>
+        <w:spacing w:before="100" w:beforeAutospacing="1" w:after="100" w:afterAutospacing="1" w:line="240" w:lineRule="auto"/>
+        <w:rPr>
+          <w:rFonts w:ascii="Times New Roman" w:eastAsia="Times New Roman" w:hAnsi="Times New Roman" w:cs="Times New Roman"/>
+          <w:sz w:val="24"/>
+          <w:szCs w:val="24"/>
+        </w:rPr>
+      </w:pPr>
+      <w:r>
+        <w:rPr>
+          <w:rFonts w:ascii="Times New Roman" w:eastAsia="Times New Roman" w:hAnsi="Times New Roman" w:cs="Times New Roman"/>
+          <w:sz w:val="24"/>
+          <w:szCs w:val="24"/>
+        </w:rPr>
+        <w:t>Given your structure:</w:t>
+      </w:r>
+    </w:p>
+    <w:p>
+      <w:pPr>
+        <w:numPr>
+          <w:ilvl w:val="0"/>
+          <w:numId w:val="1"/>
+        </w:numPr>
+        <w:spacing w:before="100" w:beforeAutospacing="1" w:after="100" w:afterAutospacing="1" w:line="240" w:lineRule="auto"/>
+        <w:rPr>
+          <w:rFonts w:ascii="Times New Roman" w:eastAsia="Times New Roman" w:hAnsi="Times New Roman" w:cs="Times New Roman"/>
+          <w:sz w:val="24"/>
+          <w:szCs w:val="24"/>
+        </w:rPr>
+      </w:pPr>
+      <w:r>
+        <w:rPr>
+          <w:rFonts w:ascii="Times New Roman" w:eastAsia="Times New Roman" w:hAnsi="Times New Roman" w:cs="Times New Roman"/>
+          <w:sz w:val="24"/>
+          <w:szCs w:val="24"/>
+        </w:rPr>
+        <w:t>Chapter 3: Research Design and Methodology</w:t>
+      </w:r>
+    </w:p>
+    <w:p>
+      <w:pPr>
+        <w:numPr>
+          <w:ilvl w:val="0"/>
+          <w:numId w:val="1"/>
+        </w:numPr>
+        <w:spacing w:before="100" w:beforeAutospacing="1" w:after="100" w:afterAutospacing="1" w:line="240" w:lineRule="auto"/>
+        <w:rPr>
+          <w:rFonts w:ascii="Times New Roman" w:eastAsia="Times New Roman" w:hAnsi="Times New Roman" w:cs="Times New Roman"/>
+          <w:sz w:val="24"/>
+          <w:szCs w:val="24"/>
+        </w:rPr>
+      </w:pPr>
+      <w:r>
+        <w:rPr>
+          <w:rFonts w:ascii="Times New Roman" w:eastAsia="Times New Roman" w:hAnsi="Times New Roman" w:cs="Times New Roman"/>
+          <w:sz w:val="24"/>
+          <w:szCs w:val="24"/>
+        </w:rPr>
+        <w:t>Chapter 4: Implementation and Analysis</w:t>
+      </w:r>
+    </w:p>
+    <w:p>
+      <w:pPr>
+        <w:spacing w:before="100" w:beforeAutospacing="1" w:after="100" w:afterAutospacing="1" w:line="240" w:lineRule="auto"/>
+        <w:rPr>
+          <w:rFonts w:ascii="Times New Roman" w:eastAsia="Times New Roman" w:hAnsi="Times New Roman" w:cs="Times New Roman"/>
+          <w:sz w:val="24"/>
+          <w:szCs w:val="24"/>
+        </w:rPr>
+      </w:pPr>
+      <w:r>
+        <w:rPr>
+          <w:rFonts w:ascii="Times New Roman" w:eastAsia="Times New Roman" w:hAnsi="Times New Roman" w:cs="Times New Roman"/>
+          <w:sz w:val="24"/>
+          <w:szCs w:val="24"/>
+        </w:rPr>
+        <w:t>I would do it like this:</w:t>
+      </w:r>
+    </w:p>
+    <w:p>
+      <w:pPr>
+        <w:spacing w:before="100" w:beforeAutospacing="1" w:after="100" w:afterAutospacing="1" w:line="240" w:lineRule="auto"/>
+        <w:outlineLvl w:val="2"/>
+        <w:rPr>
+          <w:rFonts w:ascii="Times New Roman" w:eastAsia="Times New Roman" w:hAnsi="Times New Roman" w:cs="Times New Roman"/>
+          <w:b/>
+          <w:bCs/>
+          <w:sz w:val="27"/>
+          <w:szCs w:val="27"/>
+        </w:rPr>
+      </w:pPr>
+      <w:r>
+        <w:rPr>
+          <w:rFonts w:ascii="Times New Roman" w:eastAsia="Times New Roman" w:hAnsi="Times New Roman" w:cs="Times New Roman"/>
+          <w:b/>
+          <w:bCs/>
+          <w:sz w:val="27"/>
+          <w:szCs w:val="27"/>
+        </w:rPr>
+        <w:t xml:space="preserve">Chapter 3: brief, </w:t>
+      </w:r>
+      <w:proofErr w:type="gramStart"/>
+      <w:r>
+        <w:rPr>
+          <w:rFonts w:ascii="Times New Roman" w:eastAsia="Times New Roman" w:hAnsi="Times New Roman" w:cs="Times New Roman"/>
+          <w:b/>
+          <w:bCs/>
+          <w:sz w:val="27"/>
+          <w:szCs w:val="27"/>
+        </w:rPr>
+        <w:t>high level</w:t>
+      </w:r>
+      <w:proofErr w:type="gramEnd"/>
+      <w:r>
+        <w:rPr>
+          <w:rFonts w:ascii="Times New Roman" w:eastAsia="Times New Roman" w:hAnsi="Times New Roman" w:cs="Times New Roman"/>
+          <w:b/>
+          <w:bCs/>
+          <w:sz w:val="27"/>
+          <w:szCs w:val="27"/>
+        </w:rPr>
+        <w:t xml:space="preserve"> mention</w:t>
+      </w:r>
+    </w:p>
+    <w:p>
+      <w:pPr>
+        <w:spacing w:before="100" w:beforeAutospacing="1" w:after="100" w:afterAutospacing="1" w:line="240" w:lineRule="auto"/>
+        <w:rPr>
+          <w:rFonts w:ascii="Times New Roman" w:eastAsia="Times New Roman" w:hAnsi="Times New Roman" w:cs="Times New Roman"/>
+          <w:sz w:val="24"/>
+          <w:szCs w:val="24"/>
+        </w:rPr>
+      </w:pPr>
+      <w:r>
+        <w:rPr>
+          <w:rFonts w:ascii="Times New Roman" w:eastAsia="Times New Roman" w:hAnsi="Times New Roman" w:cs="Times New Roman"/>
+          <w:sz w:val="24"/>
+          <w:szCs w:val="24"/>
+        </w:rPr>
+        <w:t xml:space="preserve">In Chapter 3 you keep things at the </w:t>
+      </w:r>
+      <w:r>
+        <w:rPr>
+          <w:rFonts w:ascii="Times New Roman" w:eastAsia="Times New Roman" w:hAnsi="Times New Roman" w:cs="Times New Roman"/>
+          <w:b/>
+          <w:bCs/>
+          <w:sz w:val="24"/>
+          <w:szCs w:val="24"/>
+        </w:rPr>
+        <w:t>design and methodology</w:t>
+      </w:r>
+      <w:r>
+        <w:rPr>
+          <w:rFonts w:ascii="Times New Roman" w:eastAsia="Times New Roman" w:hAnsi="Times New Roman" w:cs="Times New Roman"/>
+          <w:sz w:val="24"/>
+          <w:szCs w:val="24"/>
+        </w:rPr>
+        <w:t xml:space="preserve"> level. </w:t>
+      </w:r>
+      <w:proofErr w:type="gramStart"/>
+      <w:r>
+        <w:rPr>
+          <w:rFonts w:ascii="Times New Roman" w:eastAsia="Times New Roman" w:hAnsi="Times New Roman" w:cs="Times New Roman"/>
+          <w:sz w:val="24"/>
+          <w:szCs w:val="24"/>
+        </w:rPr>
+        <w:t>So</w:t>
+      </w:r>
+      <w:proofErr w:type="gramEnd"/>
+      <w:r>
+        <w:rPr>
+          <w:rFonts w:ascii="Times New Roman" w:eastAsia="Times New Roman" w:hAnsi="Times New Roman" w:cs="Times New Roman"/>
+          <w:sz w:val="24"/>
+          <w:szCs w:val="24"/>
+        </w:rPr>
+        <w:t xml:space="preserve"> you add a short subsection, for example:</w:t>
+      </w:r>
+    </w:p>
+    <w:p>
+      <w:pPr>
+        <w:numPr>
+          <w:ilvl w:val="0"/>
+          <w:numId w:val="2"/>
+        </w:numPr>
+        <w:spacing w:before="100" w:beforeAutospacing="1" w:after="100" w:afterAutospacing="1" w:line="240" w:lineRule="auto"/>
+        <w:rPr>
+          <w:rFonts w:ascii="Times New Roman" w:eastAsia="Times New Roman" w:hAnsi="Times New Roman" w:cs="Times New Roman"/>
+          <w:sz w:val="24"/>
+          <w:szCs w:val="24"/>
+        </w:rPr>
+      </w:pPr>
+      <w:r>
+        <w:rPr>
+          <w:rFonts w:ascii="Times New Roman" w:eastAsia="Times New Roman" w:hAnsi="Times New Roman" w:cs="Times New Roman"/>
+          <w:b/>
+          <w:bCs/>
+          <w:sz w:val="24"/>
+          <w:szCs w:val="24"/>
+        </w:rPr>
+        <w:t>3.6 Data Management and Computational Environment</w:t>
+      </w:r>
+    </w:p>
+    <w:p>
+      <w:pPr>
+        <w:numPr>
+          <w:ilvl w:val="1"/>
+          <w:numId w:val="2"/>
+        </w:numPr>
+        <w:spacing w:before="100" w:beforeAutospacing="1" w:after="100" w:afterAutospacing="1" w:line="240" w:lineRule="auto"/>
+        <w:rPr>
+          <w:rFonts w:ascii="Times New Roman" w:eastAsia="Times New Roman" w:hAnsi="Times New Roman" w:cs="Times New Roman"/>
+          <w:sz w:val="24"/>
+          <w:szCs w:val="24"/>
+        </w:rPr>
+      </w:pPr>
+      <w:r>
+        <w:rPr>
+          <w:rFonts w:ascii="Times New Roman" w:eastAsia="Times New Roman" w:hAnsi="Times New Roman" w:cs="Times New Roman"/>
+          <w:sz w:val="24"/>
+          <w:szCs w:val="24"/>
+        </w:rPr>
+        <w:t>Briefly state that:</w:t>
+      </w:r>
+    </w:p>
+    <w:p>
+      <w:pPr>
+        <w:numPr>
+          <w:ilvl w:val="2"/>
+          <w:numId w:val="2"/>
+        </w:numPr>
+        <w:spacing w:before="100" w:beforeAutospacing="1" w:after="100" w:afterAutospacing="1" w:line="240" w:lineRule="auto"/>
+        <w:rPr>
+          <w:rFonts w:ascii="Times New Roman" w:eastAsia="Times New Roman" w:hAnsi="Times New Roman" w:cs="Times New Roman"/>
+          <w:sz w:val="24"/>
+          <w:szCs w:val="24"/>
+        </w:rPr>
+      </w:pPr>
+      <w:r>
+        <w:rPr>
+          <w:rFonts w:ascii="Times New Roman" w:eastAsia="Times New Roman" w:hAnsi="Times New Roman" w:cs="Times New Roman"/>
+          <w:sz w:val="24"/>
+          <w:szCs w:val="24"/>
+        </w:rPr>
+        <w:t>Data are stored in PostgreSQL as the primary relational database.</w:t>
+      </w:r>
+    </w:p>
+    <w:p>
+      <w:pPr>
+        <w:numPr>
+          <w:ilvl w:val="2"/>
+          <w:numId w:val="2"/>
+        </w:numPr>
+        <w:spacing w:before="100" w:beforeAutospacing="1" w:after="100" w:afterAutospacing="1" w:line="240" w:lineRule="auto"/>
+        <w:rPr>
+          <w:rFonts w:ascii="Times New Roman" w:eastAsia="Times New Roman" w:hAnsi="Times New Roman" w:cs="Times New Roman"/>
+          <w:sz w:val="24"/>
+          <w:szCs w:val="24"/>
+        </w:rPr>
+      </w:pPr>
+      <w:proofErr w:type="spellStart"/>
+      <w:r>
+        <w:rPr>
+          <w:rFonts w:ascii="Times New Roman" w:eastAsia="Times New Roman" w:hAnsi="Times New Roman" w:cs="Times New Roman"/>
+          <w:sz w:val="24"/>
+          <w:szCs w:val="24"/>
+        </w:rPr>
+        <w:t>DuckDB</w:t>
+      </w:r>
+      <w:proofErr w:type="spellEnd"/>
+      <w:r>
+        <w:rPr>
+          <w:rFonts w:ascii="Times New Roman" w:eastAsia="Times New Roman" w:hAnsi="Times New Roman" w:cs="Times New Roman"/>
+          <w:sz w:val="24"/>
+          <w:szCs w:val="24"/>
+        </w:rPr>
+        <w:t xml:space="preserve"> is used as an embedded analytics engine for transformation and aggregation.</w:t>
+      </w:r>
+    </w:p>
+    <w:p>
+      <w:pPr>
+        <w:numPr>
+          <w:ilvl w:val="2"/>
+          <w:numId w:val="2"/>
+        </w:numPr>
+        <w:spacing w:before="100" w:beforeAutospacing="1" w:after="100" w:afterAutospacing="1" w:line="240" w:lineRule="auto"/>
+        <w:rPr>
+          <w:rFonts w:ascii="Times New Roman" w:eastAsia="Times New Roman" w:hAnsi="Times New Roman" w:cs="Times New Roman"/>
+          <w:sz w:val="24"/>
+          <w:szCs w:val="24"/>
+        </w:rPr>
+      </w:pPr>
+      <w:r>
+        <w:rPr>
+          <w:rFonts w:ascii="Times New Roman" w:eastAsia="Times New Roman" w:hAnsi="Times New Roman" w:cs="Times New Roman"/>
+          <w:sz w:val="24"/>
+          <w:szCs w:val="24"/>
+        </w:rPr>
+        <w:t xml:space="preserve">Python (with </w:t>
+      </w:r>
+      <w:proofErr w:type="spellStart"/>
+      <w:r>
+        <w:rPr>
+          <w:rFonts w:ascii="Times New Roman" w:eastAsia="Times New Roman" w:hAnsi="Times New Roman" w:cs="Times New Roman"/>
+          <w:sz w:val="24"/>
+          <w:szCs w:val="24"/>
+        </w:rPr>
+        <w:t>SQLAlchemy</w:t>
+      </w:r>
+      <w:proofErr w:type="spellEnd"/>
+      <w:r>
+        <w:rPr>
+          <w:rFonts w:ascii="Times New Roman" w:eastAsia="Times New Roman" w:hAnsi="Times New Roman" w:cs="Times New Roman"/>
+          <w:sz w:val="24"/>
+          <w:szCs w:val="24"/>
+        </w:rPr>
+        <w:t xml:space="preserve"> and </w:t>
+      </w:r>
+      <w:proofErr w:type="spellStart"/>
+      <w:r>
+        <w:rPr>
+          <w:rFonts w:ascii="Times New Roman" w:eastAsia="Times New Roman" w:hAnsi="Times New Roman" w:cs="Times New Roman"/>
+          <w:sz w:val="24"/>
+          <w:szCs w:val="24"/>
+        </w:rPr>
+        <w:t>DuckDB</w:t>
+      </w:r>
+      <w:proofErr w:type="spellEnd"/>
+      <w:r>
+        <w:rPr>
+          <w:rFonts w:ascii="Times New Roman" w:eastAsia="Times New Roman" w:hAnsi="Times New Roman" w:cs="Times New Roman"/>
+          <w:sz w:val="24"/>
+          <w:szCs w:val="24"/>
+        </w:rPr>
+        <w:t>) is used to implement the ETL and analysis pipeline.</w:t>
+      </w:r>
+    </w:p>
+    <w:p>
+      <w:pPr>
+        <w:numPr>
+          <w:ilvl w:val="1"/>
+          <w:numId w:val="2"/>
+        </w:numPr>
+        <w:spacing w:before="100" w:beforeAutospacing="1" w:after="100" w:afterAutospacing="1" w:line="240" w:lineRule="auto"/>
+        <w:rPr>
+          <w:rFonts w:ascii="Times New Roman" w:eastAsia="Times New Roman" w:hAnsi="Times New Roman" w:cs="Times New Roman"/>
+          <w:sz w:val="24"/>
+          <w:szCs w:val="24"/>
+        </w:rPr>
+      </w:pPr>
+      <w:r>
+        <w:rPr>
+          <w:rFonts w:ascii="Times New Roman" w:eastAsia="Times New Roman" w:hAnsi="Times New Roman" w:cs="Times New Roman"/>
+          <w:sz w:val="24"/>
+          <w:szCs w:val="24"/>
+        </w:rPr>
+        <w:t>This links tools to your analytical design without going into code detail.</w:t>
+      </w:r>
+    </w:p>
+    <w:p>
+      <w:pPr>
+        <w:spacing w:before="100" w:beforeAutospacing="1" w:after="100" w:afterAutospacing="1" w:line="240" w:lineRule="auto"/>
+        <w:rPr>
+          <w:rFonts w:ascii="Times New Roman" w:eastAsia="Times New Roman" w:hAnsi="Times New Roman" w:cs="Times New Roman"/>
+          <w:sz w:val="24"/>
+          <w:szCs w:val="24"/>
+        </w:rPr>
+      </w:pPr>
+      <w:r>
+        <w:rPr>
+          <w:rFonts w:ascii="Times New Roman" w:eastAsia="Times New Roman" w:hAnsi="Times New Roman" w:cs="Times New Roman"/>
+          <w:sz w:val="24"/>
+          <w:szCs w:val="24"/>
+        </w:rPr>
+        <w:t xml:space="preserve">This keeps Chapter 3 focused on </w:t>
+      </w:r>
+      <w:r>
+        <w:rPr>
+          <w:rFonts w:ascii="Times New Roman" w:eastAsia="Times New Roman" w:hAnsi="Times New Roman" w:cs="Times New Roman"/>
+          <w:i/>
+          <w:iCs/>
+          <w:sz w:val="24"/>
+          <w:szCs w:val="24"/>
+        </w:rPr>
+        <w:t>why</w:t>
+      </w:r>
+      <w:r>
+        <w:rPr>
+          <w:rFonts w:ascii="Times New Roman" w:eastAsia="Times New Roman" w:hAnsi="Times New Roman" w:cs="Times New Roman"/>
+          <w:sz w:val="24"/>
+          <w:szCs w:val="24"/>
+        </w:rPr>
+        <w:t xml:space="preserve"> and </w:t>
+      </w:r>
+      <w:r>
+        <w:rPr>
+          <w:rFonts w:ascii="Times New Roman" w:eastAsia="Times New Roman" w:hAnsi="Times New Roman" w:cs="Times New Roman"/>
+          <w:i/>
+          <w:iCs/>
+          <w:sz w:val="24"/>
+          <w:szCs w:val="24"/>
+        </w:rPr>
+        <w:t>what</w:t>
+      </w:r>
+      <w:r>
+        <w:rPr>
+          <w:rFonts w:ascii="Times New Roman" w:eastAsia="Times New Roman" w:hAnsi="Times New Roman" w:cs="Times New Roman"/>
+          <w:sz w:val="24"/>
+          <w:szCs w:val="24"/>
+        </w:rPr>
+        <w:t xml:space="preserve">, not </w:t>
+      </w:r>
+      <w:r>
+        <w:rPr>
+          <w:rFonts w:ascii="Times New Roman" w:eastAsia="Times New Roman" w:hAnsi="Times New Roman" w:cs="Times New Roman"/>
+          <w:i/>
+          <w:iCs/>
+          <w:sz w:val="24"/>
+          <w:szCs w:val="24"/>
+        </w:rPr>
+        <w:t>how exactly</w:t>
+      </w:r>
+      <w:r>
+        <w:rPr>
+          <w:rFonts w:ascii="Times New Roman" w:eastAsia="Times New Roman" w:hAnsi="Times New Roman" w:cs="Times New Roman"/>
+          <w:sz w:val="24"/>
+          <w:szCs w:val="24"/>
+        </w:rPr>
+        <w:t>.</w:t>
+      </w:r>
+    </w:p>
+    <w:p>
+      <w:pPr>
+        <w:spacing w:before="100" w:beforeAutospacing="1" w:after="100" w:afterAutospacing="1" w:line="240" w:lineRule="auto"/>
+        <w:outlineLvl w:val="2"/>
+        <w:rPr>
+          <w:rFonts w:ascii="Times New Roman" w:eastAsia="Times New Roman" w:hAnsi="Times New Roman" w:cs="Times New Roman"/>
+          <w:b/>
+          <w:bCs/>
+          <w:sz w:val="27"/>
+          <w:szCs w:val="27"/>
+        </w:rPr>
+      </w:pPr>
+      <w:r>
+        <w:rPr>
+          <w:rFonts w:ascii="Times New Roman" w:eastAsia="Times New Roman" w:hAnsi="Times New Roman" w:cs="Times New Roman"/>
+          <w:b/>
+          <w:bCs/>
+          <w:sz w:val="27"/>
+          <w:szCs w:val="27"/>
+        </w:rPr>
+        <w:lastRenderedPageBreak/>
+        <w:t>Chapter 4: full “Data Infrastructure Setup” section</w:t>
+      </w:r>
+    </w:p>
+    <w:p>
+      <w:pPr>
+        <w:spacing w:before="100" w:beforeAutospacing="1" w:after="100" w:afterAutospacing="1" w:line="240" w:lineRule="auto"/>
+        <w:rPr>
+          <w:rFonts w:ascii="Times New Roman" w:eastAsia="Times New Roman" w:hAnsi="Times New Roman" w:cs="Times New Roman"/>
+          <w:sz w:val="24"/>
+          <w:szCs w:val="24"/>
+        </w:rPr>
+      </w:pPr>
+      <w:r>
+        <w:rPr>
+          <w:rFonts w:ascii="Times New Roman" w:eastAsia="Times New Roman" w:hAnsi="Times New Roman" w:cs="Times New Roman"/>
+          <w:sz w:val="24"/>
+          <w:szCs w:val="24"/>
+        </w:rPr>
+        <w:t xml:space="preserve">The detailed text I wrote for you fits perfectly in </w:t>
+      </w:r>
+      <w:r>
+        <w:rPr>
+          <w:rFonts w:ascii="Times New Roman" w:eastAsia="Times New Roman" w:hAnsi="Times New Roman" w:cs="Times New Roman"/>
+          <w:b/>
+          <w:bCs/>
+          <w:sz w:val="24"/>
+          <w:szCs w:val="24"/>
+        </w:rPr>
+        <w:t>Chapter 4</w:t>
+      </w:r>
+      <w:r>
+        <w:rPr>
+          <w:rFonts w:ascii="Times New Roman" w:eastAsia="Times New Roman" w:hAnsi="Times New Roman" w:cs="Times New Roman"/>
+          <w:sz w:val="24"/>
+          <w:szCs w:val="24"/>
+        </w:rPr>
+        <w:t>, under Implementation, for example:</w:t>
+      </w:r>
+    </w:p>
+    <w:p>
+      <w:pPr>
+        <w:numPr>
+          <w:ilvl w:val="0"/>
+          <w:numId w:val="3"/>
+        </w:numPr>
+        <w:spacing w:before="100" w:beforeAutospacing="1" w:after="100" w:afterAutospacing="1" w:line="240" w:lineRule="auto"/>
+        <w:rPr>
+          <w:rFonts w:ascii="Times New Roman" w:eastAsia="Times New Roman" w:hAnsi="Times New Roman" w:cs="Times New Roman"/>
+          <w:sz w:val="24"/>
+          <w:szCs w:val="24"/>
+        </w:rPr>
+      </w:pPr>
+      <w:r>
+        <w:rPr>
+          <w:rFonts w:ascii="Times New Roman" w:eastAsia="Times New Roman" w:hAnsi="Times New Roman" w:cs="Times New Roman"/>
+          <w:b/>
+          <w:bCs/>
+          <w:sz w:val="24"/>
+          <w:szCs w:val="24"/>
+        </w:rPr>
+        <w:t>Chapter 4: Implementation and Analysis</w:t>
+      </w:r>
+    </w:p>
+    <w:p>
+      <w:pPr>
+        <w:numPr>
+          <w:ilvl w:val="1"/>
+          <w:numId w:val="3"/>
+        </w:numPr>
+        <w:spacing w:before="100" w:beforeAutospacing="1" w:after="100" w:afterAutospacing="1" w:line="240" w:lineRule="auto"/>
+        <w:rPr>
+          <w:rFonts w:ascii="Times New Roman" w:eastAsia="Times New Roman" w:hAnsi="Times New Roman" w:cs="Times New Roman"/>
+          <w:sz w:val="24"/>
+          <w:szCs w:val="24"/>
+        </w:rPr>
+      </w:pPr>
+      <w:r>
+        <w:rPr>
+          <w:rFonts w:ascii="Times New Roman" w:eastAsia="Times New Roman" w:hAnsi="Times New Roman" w:cs="Times New Roman"/>
+          <w:sz w:val="24"/>
+          <w:szCs w:val="24"/>
+        </w:rPr>
+        <w:t>4.1 Overview of Implementation</w:t>
+      </w:r>
+    </w:p>
+    <w:p>
+      <w:pPr>
+        <w:numPr>
+          <w:ilvl w:val="1"/>
+          <w:numId w:val="3"/>
+        </w:numPr>
+        <w:spacing w:before="100" w:beforeAutospacing="1" w:after="100" w:afterAutospacing="1" w:line="240" w:lineRule="auto"/>
+        <w:rPr>
+          <w:rFonts w:ascii="Times New Roman" w:eastAsia="Times New Roman" w:hAnsi="Times New Roman" w:cs="Times New Roman"/>
+          <w:sz w:val="24"/>
+          <w:szCs w:val="24"/>
+        </w:rPr>
+      </w:pPr>
+      <w:r>
+        <w:rPr>
+          <w:rFonts w:ascii="Times New Roman" w:eastAsia="Times New Roman" w:hAnsi="Times New Roman" w:cs="Times New Roman"/>
+          <w:b/>
+          <w:bCs/>
+          <w:sz w:val="24"/>
+          <w:szCs w:val="24"/>
+        </w:rPr>
+        <w:t>4.2 Data Infrastructure Setup</w:t>
+      </w:r>
+      <w:r>
+        <w:rPr>
+          <w:rFonts w:ascii="Times New Roman" w:eastAsia="Times New Roman" w:hAnsi="Times New Roman" w:cs="Times New Roman"/>
+          <w:sz w:val="24"/>
+          <w:szCs w:val="24"/>
+        </w:rPr>
+        <w:t xml:space="preserve"> ← put the detailed section here</w:t>
+      </w:r>
+    </w:p>
+    <w:p>
+      <w:pPr>
+        <w:numPr>
+          <w:ilvl w:val="1"/>
+          <w:numId w:val="3"/>
+        </w:numPr>
+        <w:spacing w:before="100" w:beforeAutospacing="1" w:after="100" w:afterAutospacing="1" w:line="240" w:lineRule="auto"/>
+        <w:rPr>
+          <w:rFonts w:ascii="Times New Roman" w:eastAsia="Times New Roman" w:hAnsi="Times New Roman" w:cs="Times New Roman"/>
+          <w:sz w:val="24"/>
+          <w:szCs w:val="24"/>
+        </w:rPr>
+      </w:pPr>
+      <w:r>
+        <w:rPr>
+          <w:rFonts w:ascii="Times New Roman" w:eastAsia="Times New Roman" w:hAnsi="Times New Roman" w:cs="Times New Roman"/>
+          <w:sz w:val="24"/>
+          <w:szCs w:val="24"/>
+        </w:rPr>
+        <w:t>4.3 Data Preprocessing and Feature Engineering</w:t>
+      </w:r>
+    </w:p>
+    <w:p>
+      <w:pPr>
+        <w:numPr>
+          <w:ilvl w:val="1"/>
+          <w:numId w:val="3"/>
+        </w:numPr>
+        <w:spacing w:before="100" w:beforeAutospacing="1" w:after="100" w:afterAutospacing="1" w:line="240" w:lineRule="auto"/>
+        <w:rPr>
+          <w:rFonts w:ascii="Times New Roman" w:eastAsia="Times New Roman" w:hAnsi="Times New Roman" w:cs="Times New Roman"/>
+          <w:sz w:val="24"/>
+          <w:szCs w:val="24"/>
+        </w:rPr>
+      </w:pPr>
+      <w:r>
+        <w:rPr>
+          <w:rFonts w:ascii="Times New Roman" w:eastAsia="Times New Roman" w:hAnsi="Times New Roman" w:cs="Times New Roman"/>
+          <w:sz w:val="24"/>
+          <w:szCs w:val="24"/>
+        </w:rPr>
+        <w:t>4.4 Model or Agent Design and Training</w:t>
+      </w:r>
+    </w:p>
+    <w:p>
+      <w:pPr>
+        <w:numPr>
+          <w:ilvl w:val="1"/>
+          <w:numId w:val="3"/>
+        </w:numPr>
+        <w:spacing w:before="100" w:beforeAutospacing="1" w:after="100" w:afterAutospacing="1" w:line="240" w:lineRule="auto"/>
+        <w:rPr>
+          <w:rFonts w:ascii="Times New Roman" w:eastAsia="Times New Roman" w:hAnsi="Times New Roman" w:cs="Times New Roman"/>
+          <w:sz w:val="24"/>
+          <w:szCs w:val="24"/>
+        </w:rPr>
+      </w:pPr>
+      <w:r>
+        <w:rPr>
+          <w:rFonts w:ascii="Times New Roman" w:eastAsia="Times New Roman" w:hAnsi="Times New Roman" w:cs="Times New Roman"/>
+          <w:sz w:val="24"/>
+          <w:szCs w:val="24"/>
+        </w:rPr>
+        <w:t>4.5 Evaluation Procedures</w:t>
+      </w:r>
+    </w:p>
+    <w:p>
+      <w:pPr>
+        <w:spacing w:before="100" w:beforeAutospacing="1" w:after="100" w:afterAutospacing="1" w:line="240" w:lineRule="auto"/>
+        <w:rPr>
+          <w:rFonts w:ascii="Times New Roman" w:eastAsia="Times New Roman" w:hAnsi="Times New Roman" w:cs="Times New Roman"/>
+          <w:sz w:val="24"/>
+          <w:szCs w:val="24"/>
+        </w:rPr>
+      </w:pPr>
+      <w:r>
+        <w:rPr>
+          <w:rFonts w:ascii="Times New Roman" w:eastAsia="Times New Roman" w:hAnsi="Times New Roman" w:cs="Times New Roman"/>
+          <w:sz w:val="24"/>
+          <w:szCs w:val="24"/>
+        </w:rPr>
+        <w:t>So:</w:t>
+      </w:r>
+    </w:p>
+    <w:p>
+      <w:pPr>
+        <w:numPr>
+          <w:ilvl w:val="0"/>
+          <w:numId w:val="4"/>
+        </w:numPr>
+        <w:spacing w:before="100" w:beforeAutospacing="1" w:after="100" w:afterAutospacing="1" w:line="240" w:lineRule="auto"/>
+        <w:rPr>
+          <w:rFonts w:ascii="Times New Roman" w:eastAsia="Times New Roman" w:hAnsi="Times New Roman" w:cs="Times New Roman"/>
+          <w:sz w:val="24"/>
+          <w:szCs w:val="24"/>
+        </w:rPr>
+      </w:pPr>
+      <w:r>
+        <w:rPr>
+          <w:rFonts w:ascii="Times New Roman" w:eastAsia="Times New Roman" w:hAnsi="Times New Roman" w:cs="Times New Roman"/>
+          <w:sz w:val="24"/>
+          <w:szCs w:val="24"/>
+        </w:rPr>
+        <w:t>Chapter 3: short design explanation</w:t>
+      </w:r>
+    </w:p>
+    <w:p>
+      <w:pPr>
+        <w:numPr>
+          <w:ilvl w:val="0"/>
+          <w:numId w:val="4"/>
+        </w:numPr>
+        <w:spacing w:before="100" w:beforeAutospacing="1" w:after="100" w:afterAutospacing="1" w:line="240" w:lineRule="auto"/>
+        <w:rPr>
+          <w:rFonts w:ascii="Times New Roman" w:eastAsia="Times New Roman" w:hAnsi="Times New Roman" w:cs="Times New Roman"/>
+          <w:sz w:val="24"/>
+          <w:szCs w:val="24"/>
+        </w:rPr>
+      </w:pPr>
+      <w:r>
+        <w:rPr>
+          <w:rFonts w:ascii="Times New Roman" w:eastAsia="Times New Roman" w:hAnsi="Times New Roman" w:cs="Times New Roman"/>
+          <w:sz w:val="24"/>
+          <w:szCs w:val="24"/>
+        </w:rPr>
+        <w:t xml:space="preserve">Chapter 4: full technical story with PostgreSQL, </w:t>
+      </w:r>
+      <w:proofErr w:type="spellStart"/>
+      <w:r>
+        <w:rPr>
+          <w:rFonts w:ascii="Times New Roman" w:eastAsia="Times New Roman" w:hAnsi="Times New Roman" w:cs="Times New Roman"/>
+          <w:sz w:val="24"/>
+          <w:szCs w:val="24"/>
+        </w:rPr>
+        <w:t>DuckDB</w:t>
+      </w:r>
+      <w:proofErr w:type="spellEnd"/>
+      <w:r>
+        <w:rPr>
+          <w:rFonts w:ascii="Times New Roman" w:eastAsia="Times New Roman" w:hAnsi="Times New Roman" w:cs="Times New Roman"/>
+          <w:sz w:val="24"/>
+          <w:szCs w:val="24"/>
+        </w:rPr>
+        <w:t>, ETL, diagnostic script, etc.</w:t>
+      </w:r>
+    </w:p>
+    <w:p/>
     <w:sectPr>
       <w:pgSz w:w="12240" w:h="15840"/>
       <w:pgMar w:top="1440" w:right="1440" w:bottom="1440" w:left="1440" w:header="720" w:footer="720" w:gutter="0"/>
@@ -262,6 +1002,619 @@
     </w:sectPr>
   </w:body>
 </w:document>
+</file>
+
+<file path=word/numbering.xml><?xml version="1.0" encoding="utf-8"?>
+<w:numbering xmlns:wpc="http://schemas.microsoft.com/office/word/2010/wordprocessingCanvas" xmlns:cx="http://schemas.microsoft.com/office/drawing/2014/chartex" xmlns:cx1="http://schemas.microsoft.com/office/drawing/2015/9/8/chartex" xmlns:cx2="http://schemas.microsoft.com/office/drawing/2015/10/21/chartex" xmlns:cx3="http://schemas.microsoft.com/office/drawing/2016/5/9/chartex" xmlns:cx4="http://schemas.microsoft.com/office/drawing/2016/5/10/chartex" xmlns:cx5="http://schemas.microsoft.com/office/drawing/2016/5/11/chartex" xmlns:cx6="http://schemas.microsoft.com/office/drawing/2016/5/12/chartex" xmlns:cx7="http://schemas.microsoft.com/office/drawing/2016/5/13/chartex" xmlns:cx8="http://schemas.microsoft.com/office/drawing/2016/5/14/chartex" xmlns:mc="http://schemas.openxmlformats.org/markup-compatibility/2006" xmlns:aink="http://schemas.microsoft.com/office/drawing/2016/ink" xmlns:am3d="http://schemas.microsoft.com/office/drawing/2017/model3d" xmlns:o="urn:schemas-microsoft-com:office:office" xmlns:r="http://schemas.openxmlformats.org/officeDocument/2006/relationships" xmlns:m="http://schemas.openxmlformats.org/officeDocument/2006/math" xmlns:v="urn:schemas-microsoft-com:vml" xmlns:wp14="http://schemas.microsoft.com/office/word/2010/wordprocessingDrawing" xmlns:wp="http://schemas.openxmlformats.org/drawingml/2006/wordprocessingDrawing" xmlns:w10="urn:schemas-microsoft-com:office:word" xmlns:w="http://schemas.openxmlformats.org/wordprocessingml/2006/main" xmlns:w14="http://schemas.microsoft.com/office/word/2010/wordml" xmlns:w15="http://schemas.microsoft.com/office/word/2012/wordml" xmlns:w16cex="http://schemas.microsoft.com/office/word/2018/wordml/cex" xmlns:w16cid="http://schemas.microsoft.com/office/word/2016/wordml/cid" xmlns:w16="http://schemas.microsoft.com/office/word/2018/wordml" xmlns:w16sdtdh="http://schemas.microsoft.com/office/word/2020/wordml/sdtdatahash" xmlns:w16se="http://schemas.microsoft.com/office/word/2015/wordml/symex" xmlns:wpg="http://schemas.microsoft.com/office/word/2010/wordprocessingGroup" xmlns:wpi="http://schemas.microsoft.com/office/word/2010/wordprocessingInk" xmlns:wne="http://schemas.microsoft.com/office/word/2006/wordml" xmlns:wps="http://schemas.microsoft.com/office/word/2010/wordprocessingShape" mc:Ignorable="w14 w15 w16se w16cid w16 w16cex w16sdtdh wp14">
+  <w:abstractNum w:abstractNumId="0" w15:restartNumberingAfterBreak="0">
+    <w:nsid w:val="0DC919FC"/>
+    <w:multiLevelType w:val="multilevel"/>
+    <w:tmpl w:val="198A286A"/>
+    <w:lvl w:ilvl="0">
+      <w:start w:val="1"/>
+      <w:numFmt w:val="bullet"/>
+      <w:lvlText w:val=""/>
+      <w:lvlJc w:val="left"/>
+      <w:pPr>
+        <w:tabs>
+          <w:tab w:val="num" w:pos="720"/>
+        </w:tabs>
+        <w:ind w:left="720" w:hanging="360"/>
+      </w:pPr>
+      <w:rPr>
+        <w:rFonts w:ascii="Symbol" w:hAnsi="Symbol" w:hint="default"/>
+        <w:sz w:val="20"/>
+      </w:rPr>
+    </w:lvl>
+    <w:lvl w:ilvl="1">
+      <w:start w:val="1"/>
+      <w:numFmt w:val="bullet"/>
+      <w:lvlText w:val="o"/>
+      <w:lvlJc w:val="left"/>
+      <w:pPr>
+        <w:tabs>
+          <w:tab w:val="num" w:pos="1440"/>
+        </w:tabs>
+        <w:ind w:left="1440" w:hanging="360"/>
+      </w:pPr>
+      <w:rPr>
+        <w:rFonts w:ascii="Courier New" w:hAnsi="Courier New" w:hint="default"/>
+        <w:sz w:val="20"/>
+      </w:rPr>
+    </w:lvl>
+    <w:lvl w:ilvl="2">
+      <w:start w:val="1"/>
+      <w:numFmt w:val="bullet"/>
+      <w:lvlText w:val=""/>
+      <w:lvlJc w:val="left"/>
+      <w:pPr>
+        <w:tabs>
+          <w:tab w:val="num" w:pos="2160"/>
+        </w:tabs>
+        <w:ind w:left="2160" w:hanging="360"/>
+      </w:pPr>
+      <w:rPr>
+        <w:rFonts w:ascii="Wingdings" w:hAnsi="Wingdings" w:hint="default"/>
+        <w:sz w:val="20"/>
+      </w:rPr>
+    </w:lvl>
+    <w:lvl w:ilvl="3" w:tentative="1">
+      <w:start w:val="1"/>
+      <w:numFmt w:val="bullet"/>
+      <w:lvlText w:val=""/>
+      <w:lvlJc w:val="left"/>
+      <w:pPr>
+        <w:tabs>
+          <w:tab w:val="num" w:pos="2880"/>
+        </w:tabs>
+        <w:ind w:left="2880" w:hanging="360"/>
+      </w:pPr>
+      <w:rPr>
+        <w:rFonts w:ascii="Wingdings" w:hAnsi="Wingdings" w:hint="default"/>
+        <w:sz w:val="20"/>
+      </w:rPr>
+    </w:lvl>
+    <w:lvl w:ilvl="4" w:tentative="1">
+      <w:start w:val="1"/>
+      <w:numFmt w:val="bullet"/>
+      <w:lvlText w:val=""/>
+      <w:lvlJc w:val="left"/>
+      <w:pPr>
+        <w:tabs>
+          <w:tab w:val="num" w:pos="3600"/>
+        </w:tabs>
+        <w:ind w:left="3600" w:hanging="360"/>
+      </w:pPr>
+      <w:rPr>
+        <w:rFonts w:ascii="Wingdings" w:hAnsi="Wingdings" w:hint="default"/>
+        <w:sz w:val="20"/>
+      </w:rPr>
+    </w:lvl>
+    <w:lvl w:ilvl="5" w:tentative="1">
+      <w:start w:val="1"/>
+      <w:numFmt w:val="bullet"/>
+      <w:lvlText w:val=""/>
+      <w:lvlJc w:val="left"/>
+      <w:pPr>
+        <w:tabs>
+          <w:tab w:val="num" w:pos="4320"/>
+        </w:tabs>
+        <w:ind w:left="4320" w:hanging="360"/>
+      </w:pPr>
+      <w:rPr>
+        <w:rFonts w:ascii="Wingdings" w:hAnsi="Wingdings" w:hint="default"/>
+        <w:sz w:val="20"/>
+      </w:rPr>
+    </w:lvl>
+    <w:lvl w:ilvl="6" w:tentative="1">
+      <w:start w:val="1"/>
+      <w:numFmt w:val="bullet"/>
+      <w:lvlText w:val=""/>
+      <w:lvlJc w:val="left"/>
+      <w:pPr>
+        <w:tabs>
+          <w:tab w:val="num" w:pos="5040"/>
+        </w:tabs>
+        <w:ind w:left="5040" w:hanging="360"/>
+      </w:pPr>
+      <w:rPr>
+        <w:rFonts w:ascii="Wingdings" w:hAnsi="Wingdings" w:hint="default"/>
+        <w:sz w:val="20"/>
+      </w:rPr>
+    </w:lvl>
+    <w:lvl w:ilvl="7" w:tentative="1">
+      <w:start w:val="1"/>
+      <w:numFmt w:val="bullet"/>
+      <w:lvlText w:val=""/>
+      <w:lvlJc w:val="left"/>
+      <w:pPr>
+        <w:tabs>
+          <w:tab w:val="num" w:pos="5760"/>
+        </w:tabs>
+        <w:ind w:left="5760" w:hanging="360"/>
+      </w:pPr>
+      <w:rPr>
+        <w:rFonts w:ascii="Wingdings" w:hAnsi="Wingdings" w:hint="default"/>
+        <w:sz w:val="20"/>
+      </w:rPr>
+    </w:lvl>
+    <w:lvl w:ilvl="8" w:tentative="1">
+      <w:start w:val="1"/>
+      <w:numFmt w:val="bullet"/>
+      <w:lvlText w:val=""/>
+      <w:lvlJc w:val="left"/>
+      <w:pPr>
+        <w:tabs>
+          <w:tab w:val="num" w:pos="6480"/>
+        </w:tabs>
+        <w:ind w:left="6480" w:hanging="360"/>
+      </w:pPr>
+      <w:rPr>
+        <w:rFonts w:ascii="Wingdings" w:hAnsi="Wingdings" w:hint="default"/>
+        <w:sz w:val="20"/>
+      </w:rPr>
+    </w:lvl>
+  </w:abstractNum>
+  <w:abstractNum w:abstractNumId="1" w15:restartNumberingAfterBreak="0">
+    <w:nsid w:val="5E372385"/>
+    <w:multiLevelType w:val="multilevel"/>
+    <w:tmpl w:val="ACFCC9A8"/>
+    <w:lvl w:ilvl="0">
+      <w:start w:val="1"/>
+      <w:numFmt w:val="bullet"/>
+      <w:lvlText w:val=""/>
+      <w:lvlJc w:val="left"/>
+      <w:pPr>
+        <w:tabs>
+          <w:tab w:val="num" w:pos="720"/>
+        </w:tabs>
+        <w:ind w:left="720" w:hanging="360"/>
+      </w:pPr>
+      <w:rPr>
+        <w:rFonts w:ascii="Symbol" w:hAnsi="Symbol" w:hint="default"/>
+        <w:sz w:val="20"/>
+      </w:rPr>
+    </w:lvl>
+    <w:lvl w:ilvl="1">
+      <w:start w:val="1"/>
+      <w:numFmt w:val="bullet"/>
+      <w:lvlText w:val="o"/>
+      <w:lvlJc w:val="left"/>
+      <w:pPr>
+        <w:tabs>
+          <w:tab w:val="num" w:pos="1440"/>
+        </w:tabs>
+        <w:ind w:left="1440" w:hanging="360"/>
+      </w:pPr>
+      <w:rPr>
+        <w:rFonts w:ascii="Courier New" w:hAnsi="Courier New" w:hint="default"/>
+        <w:sz w:val="20"/>
+      </w:rPr>
+    </w:lvl>
+    <w:lvl w:ilvl="2" w:tentative="1">
+      <w:start w:val="1"/>
+      <w:numFmt w:val="bullet"/>
+      <w:lvlText w:val=""/>
+      <w:lvlJc w:val="left"/>
+      <w:pPr>
+        <w:tabs>
+          <w:tab w:val="num" w:pos="2160"/>
+        </w:tabs>
+        <w:ind w:left="2160" w:hanging="360"/>
+      </w:pPr>
+      <w:rPr>
+        <w:rFonts w:ascii="Wingdings" w:hAnsi="Wingdings" w:hint="default"/>
+        <w:sz w:val="20"/>
+      </w:rPr>
+    </w:lvl>
+    <w:lvl w:ilvl="3" w:tentative="1">
+      <w:start w:val="1"/>
+      <w:numFmt w:val="bullet"/>
+      <w:lvlText w:val=""/>
+      <w:lvlJc w:val="left"/>
+      <w:pPr>
+        <w:tabs>
+          <w:tab w:val="num" w:pos="2880"/>
+        </w:tabs>
+        <w:ind w:left="2880" w:hanging="360"/>
+      </w:pPr>
+      <w:rPr>
+        <w:rFonts w:ascii="Wingdings" w:hAnsi="Wingdings" w:hint="default"/>
+        <w:sz w:val="20"/>
+      </w:rPr>
+    </w:lvl>
+    <w:lvl w:ilvl="4" w:tentative="1">
+      <w:start w:val="1"/>
+      <w:numFmt w:val="bullet"/>
+      <w:lvlText w:val=""/>
+      <w:lvlJc w:val="left"/>
+      <w:pPr>
+        <w:tabs>
+          <w:tab w:val="num" w:pos="3600"/>
+        </w:tabs>
+        <w:ind w:left="3600" w:hanging="360"/>
+      </w:pPr>
+      <w:rPr>
+        <w:rFonts w:ascii="Wingdings" w:hAnsi="Wingdings" w:hint="default"/>
+        <w:sz w:val="20"/>
+      </w:rPr>
+    </w:lvl>
+    <w:lvl w:ilvl="5" w:tentative="1">
+      <w:start w:val="1"/>
+      <w:numFmt w:val="bullet"/>
+      <w:lvlText w:val=""/>
+      <w:lvlJc w:val="left"/>
+      <w:pPr>
+        <w:tabs>
+          <w:tab w:val="num" w:pos="4320"/>
+        </w:tabs>
+        <w:ind w:left="4320" w:hanging="360"/>
+      </w:pPr>
+      <w:rPr>
+        <w:rFonts w:ascii="Wingdings" w:hAnsi="Wingdings" w:hint="default"/>
+        <w:sz w:val="20"/>
+      </w:rPr>
+    </w:lvl>
+    <w:lvl w:ilvl="6" w:tentative="1">
+      <w:start w:val="1"/>
+      <w:numFmt w:val="bullet"/>
+      <w:lvlText w:val=""/>
+      <w:lvlJc w:val="left"/>
+      <w:pPr>
+        <w:tabs>
+          <w:tab w:val="num" w:pos="5040"/>
+        </w:tabs>
+        <w:ind w:left="5040" w:hanging="360"/>
+      </w:pPr>
+      <w:rPr>
+        <w:rFonts w:ascii="Wingdings" w:hAnsi="Wingdings" w:hint="default"/>
+        <w:sz w:val="20"/>
+      </w:rPr>
+    </w:lvl>
+    <w:lvl w:ilvl="7" w:tentative="1">
+      <w:start w:val="1"/>
+      <w:numFmt w:val="bullet"/>
+      <w:lvlText w:val=""/>
+      <w:lvlJc w:val="left"/>
+      <w:pPr>
+        <w:tabs>
+          <w:tab w:val="num" w:pos="5760"/>
+        </w:tabs>
+        <w:ind w:left="5760" w:hanging="360"/>
+      </w:pPr>
+      <w:rPr>
+        <w:rFonts w:ascii="Wingdings" w:hAnsi="Wingdings" w:hint="default"/>
+        <w:sz w:val="20"/>
+      </w:rPr>
+    </w:lvl>
+    <w:lvl w:ilvl="8" w:tentative="1">
+      <w:start w:val="1"/>
+      <w:numFmt w:val="bullet"/>
+      <w:lvlText w:val=""/>
+      <w:lvlJc w:val="left"/>
+      <w:pPr>
+        <w:tabs>
+          <w:tab w:val="num" w:pos="6480"/>
+        </w:tabs>
+        <w:ind w:left="6480" w:hanging="360"/>
+      </w:pPr>
+      <w:rPr>
+        <w:rFonts w:ascii="Wingdings" w:hAnsi="Wingdings" w:hint="default"/>
+        <w:sz w:val="20"/>
+      </w:rPr>
+    </w:lvl>
+  </w:abstractNum>
+  <w:abstractNum w:abstractNumId="2" w15:restartNumberingAfterBreak="0">
+    <w:nsid w:val="66551E75"/>
+    <w:multiLevelType w:val="multilevel"/>
+    <w:tmpl w:val="2CF4F4DA"/>
+    <w:lvl w:ilvl="0">
+      <w:start w:val="1"/>
+      <w:numFmt w:val="bullet"/>
+      <w:lvlText w:val=""/>
+      <w:lvlJc w:val="left"/>
+      <w:pPr>
+        <w:tabs>
+          <w:tab w:val="num" w:pos="720"/>
+        </w:tabs>
+        <w:ind w:left="720" w:hanging="360"/>
+      </w:pPr>
+      <w:rPr>
+        <w:rFonts w:ascii="Symbol" w:hAnsi="Symbol" w:hint="default"/>
+        <w:sz w:val="20"/>
+      </w:rPr>
+    </w:lvl>
+    <w:lvl w:ilvl="1" w:tentative="1">
+      <w:start w:val="1"/>
+      <w:numFmt w:val="bullet"/>
+      <w:lvlText w:val="o"/>
+      <w:lvlJc w:val="left"/>
+      <w:pPr>
+        <w:tabs>
+          <w:tab w:val="num" w:pos="1440"/>
+        </w:tabs>
+        <w:ind w:left="1440" w:hanging="360"/>
+      </w:pPr>
+      <w:rPr>
+        <w:rFonts w:ascii="Courier New" w:hAnsi="Courier New" w:hint="default"/>
+        <w:sz w:val="20"/>
+      </w:rPr>
+    </w:lvl>
+    <w:lvl w:ilvl="2" w:tentative="1">
+      <w:start w:val="1"/>
+      <w:numFmt w:val="bullet"/>
+      <w:lvlText w:val=""/>
+      <w:lvlJc w:val="left"/>
+      <w:pPr>
+        <w:tabs>
+          <w:tab w:val="num" w:pos="2160"/>
+        </w:tabs>
+        <w:ind w:left="2160" w:hanging="360"/>
+      </w:pPr>
+      <w:rPr>
+        <w:rFonts w:ascii="Wingdings" w:hAnsi="Wingdings" w:hint="default"/>
+        <w:sz w:val="20"/>
+      </w:rPr>
+    </w:lvl>
+    <w:lvl w:ilvl="3" w:tentative="1">
+      <w:start w:val="1"/>
+      <w:numFmt w:val="bullet"/>
+      <w:lvlText w:val=""/>
+      <w:lvlJc w:val="left"/>
+      <w:pPr>
+        <w:tabs>
+          <w:tab w:val="num" w:pos="2880"/>
+        </w:tabs>
+        <w:ind w:left="2880" w:hanging="360"/>
+      </w:pPr>
+      <w:rPr>
+        <w:rFonts w:ascii="Wingdings" w:hAnsi="Wingdings" w:hint="default"/>
+        <w:sz w:val="20"/>
+      </w:rPr>
+    </w:lvl>
+    <w:lvl w:ilvl="4" w:tentative="1">
+      <w:start w:val="1"/>
+      <w:numFmt w:val="bullet"/>
+      <w:lvlText w:val=""/>
+      <w:lvlJc w:val="left"/>
+      <w:pPr>
+        <w:tabs>
+          <w:tab w:val="num" w:pos="3600"/>
+        </w:tabs>
+        <w:ind w:left="3600" w:hanging="360"/>
+      </w:pPr>
+      <w:rPr>
+        <w:rFonts w:ascii="Wingdings" w:hAnsi="Wingdings" w:hint="default"/>
+        <w:sz w:val="20"/>
+      </w:rPr>
+    </w:lvl>
+    <w:lvl w:ilvl="5" w:tentative="1">
+      <w:start w:val="1"/>
+      <w:numFmt w:val="bullet"/>
+      <w:lvlText w:val=""/>
+      <w:lvlJc w:val="left"/>
+      <w:pPr>
+        <w:tabs>
+          <w:tab w:val="num" w:pos="4320"/>
+        </w:tabs>
+        <w:ind w:left="4320" w:hanging="360"/>
+      </w:pPr>
+      <w:rPr>
+        <w:rFonts w:ascii="Wingdings" w:hAnsi="Wingdings" w:hint="default"/>
+        <w:sz w:val="20"/>
+      </w:rPr>
+    </w:lvl>
+    <w:lvl w:ilvl="6" w:tentative="1">
+      <w:start w:val="1"/>
+      <w:numFmt w:val="bullet"/>
+      <w:lvlText w:val=""/>
+      <w:lvlJc w:val="left"/>
+      <w:pPr>
+        <w:tabs>
+          <w:tab w:val="num" w:pos="5040"/>
+        </w:tabs>
+        <w:ind w:left="5040" w:hanging="360"/>
+      </w:pPr>
+      <w:rPr>
+        <w:rFonts w:ascii="Wingdings" w:hAnsi="Wingdings" w:hint="default"/>
+        <w:sz w:val="20"/>
+      </w:rPr>
+    </w:lvl>
+    <w:lvl w:ilvl="7" w:tentative="1">
+      <w:start w:val="1"/>
+      <w:numFmt w:val="bullet"/>
+      <w:lvlText w:val=""/>
+      <w:lvlJc w:val="left"/>
+      <w:pPr>
+        <w:tabs>
+          <w:tab w:val="num" w:pos="5760"/>
+        </w:tabs>
+        <w:ind w:left="5760" w:hanging="360"/>
+      </w:pPr>
+      <w:rPr>
+        <w:rFonts w:ascii="Wingdings" w:hAnsi="Wingdings" w:hint="default"/>
+        <w:sz w:val="20"/>
+      </w:rPr>
+    </w:lvl>
+    <w:lvl w:ilvl="8" w:tentative="1">
+      <w:start w:val="1"/>
+      <w:numFmt w:val="bullet"/>
+      <w:lvlText w:val=""/>
+      <w:lvlJc w:val="left"/>
+      <w:pPr>
+        <w:tabs>
+          <w:tab w:val="num" w:pos="6480"/>
+        </w:tabs>
+        <w:ind w:left="6480" w:hanging="360"/>
+      </w:pPr>
+      <w:rPr>
+        <w:rFonts w:ascii="Wingdings" w:hAnsi="Wingdings" w:hint="default"/>
+        <w:sz w:val="20"/>
+      </w:rPr>
+    </w:lvl>
+  </w:abstractNum>
+  <w:abstractNum w:abstractNumId="3" w15:restartNumberingAfterBreak="0">
+    <w:nsid w:val="7F425B01"/>
+    <w:multiLevelType w:val="multilevel"/>
+    <w:tmpl w:val="1C6EEE8C"/>
+    <w:lvl w:ilvl="0">
+      <w:start w:val="1"/>
+      <w:numFmt w:val="bullet"/>
+      <w:lvlText w:val=""/>
+      <w:lvlJc w:val="left"/>
+      <w:pPr>
+        <w:tabs>
+          <w:tab w:val="num" w:pos="720"/>
+        </w:tabs>
+        <w:ind w:left="720" w:hanging="360"/>
+      </w:pPr>
+      <w:rPr>
+        <w:rFonts w:ascii="Symbol" w:hAnsi="Symbol" w:hint="default"/>
+        <w:sz w:val="20"/>
+      </w:rPr>
+    </w:lvl>
+    <w:lvl w:ilvl="1" w:tentative="1">
+      <w:start w:val="1"/>
+      <w:numFmt w:val="bullet"/>
+      <w:lvlText w:val="o"/>
+      <w:lvlJc w:val="left"/>
+      <w:pPr>
+        <w:tabs>
+          <w:tab w:val="num" w:pos="1440"/>
+        </w:tabs>
+        <w:ind w:left="1440" w:hanging="360"/>
+      </w:pPr>
+      <w:rPr>
+        <w:rFonts w:ascii="Courier New" w:hAnsi="Courier New" w:hint="default"/>
+        <w:sz w:val="20"/>
+      </w:rPr>
+    </w:lvl>
+    <w:lvl w:ilvl="2" w:tentative="1">
+      <w:start w:val="1"/>
+      <w:numFmt w:val="bullet"/>
+      <w:lvlText w:val=""/>
+      <w:lvlJc w:val="left"/>
+      <w:pPr>
+        <w:tabs>
+          <w:tab w:val="num" w:pos="2160"/>
+        </w:tabs>
+        <w:ind w:left="2160" w:hanging="360"/>
+      </w:pPr>
+      <w:rPr>
+        <w:rFonts w:ascii="Wingdings" w:hAnsi="Wingdings" w:hint="default"/>
+        <w:sz w:val="20"/>
+      </w:rPr>
+    </w:lvl>
+    <w:lvl w:ilvl="3" w:tentative="1">
+      <w:start w:val="1"/>
+      <w:numFmt w:val="bullet"/>
+      <w:lvlText w:val=""/>
+      <w:lvlJc w:val="left"/>
+      <w:pPr>
+        <w:tabs>
+          <w:tab w:val="num" w:pos="2880"/>
+        </w:tabs>
+        <w:ind w:left="2880" w:hanging="360"/>
+      </w:pPr>
+      <w:rPr>
+        <w:rFonts w:ascii="Wingdings" w:hAnsi="Wingdings" w:hint="default"/>
+        <w:sz w:val="20"/>
+      </w:rPr>
+    </w:lvl>
+    <w:lvl w:ilvl="4" w:tentative="1">
+      <w:start w:val="1"/>
+      <w:numFmt w:val="bullet"/>
+      <w:lvlText w:val=""/>
+      <w:lvlJc w:val="left"/>
+      <w:pPr>
+        <w:tabs>
+          <w:tab w:val="num" w:pos="3600"/>
+        </w:tabs>
+        <w:ind w:left="3600" w:hanging="360"/>
+      </w:pPr>
+      <w:rPr>
+        <w:rFonts w:ascii="Wingdings" w:hAnsi="Wingdings" w:hint="default"/>
+        <w:sz w:val="20"/>
+      </w:rPr>
+    </w:lvl>
+    <w:lvl w:ilvl="5" w:tentative="1">
+      <w:start w:val="1"/>
+      <w:numFmt w:val="bullet"/>
+      <w:lvlText w:val=""/>
+      <w:lvlJc w:val="left"/>
+      <w:pPr>
+        <w:tabs>
+          <w:tab w:val="num" w:pos="4320"/>
+        </w:tabs>
+        <w:ind w:left="4320" w:hanging="360"/>
+      </w:pPr>
+      <w:rPr>
+        <w:rFonts w:ascii="Wingdings" w:hAnsi="Wingdings" w:hint="default"/>
+        <w:sz w:val="20"/>
+      </w:rPr>
+    </w:lvl>
+    <w:lvl w:ilvl="6" w:tentative="1">
+      <w:start w:val="1"/>
+      <w:numFmt w:val="bullet"/>
+      <w:lvlText w:val=""/>
+      <w:lvlJc w:val="left"/>
+      <w:pPr>
+        <w:tabs>
+          <w:tab w:val="num" w:pos="5040"/>
+        </w:tabs>
+        <w:ind w:left="5040" w:hanging="360"/>
+      </w:pPr>
+      <w:rPr>
+        <w:rFonts w:ascii="Wingdings" w:hAnsi="Wingdings" w:hint="default"/>
+        <w:sz w:val="20"/>
+      </w:rPr>
+    </w:lvl>
+    <w:lvl w:ilvl="7" w:tentative="1">
+      <w:start w:val="1"/>
+      <w:numFmt w:val="bullet"/>
+      <w:lvlText w:val=""/>
+      <w:lvlJc w:val="left"/>
+      <w:pPr>
+        <w:tabs>
+          <w:tab w:val="num" w:pos="5760"/>
+        </w:tabs>
+        <w:ind w:left="5760" w:hanging="360"/>
+      </w:pPr>
+      <w:rPr>
+        <w:rFonts w:ascii="Wingdings" w:hAnsi="Wingdings" w:hint="default"/>
+        <w:sz w:val="20"/>
+      </w:rPr>
+    </w:lvl>
+    <w:lvl w:ilvl="8" w:tentative="1">
+      <w:start w:val="1"/>
+      <w:numFmt w:val="bullet"/>
+      <w:lvlText w:val=""/>
+      <w:lvlJc w:val="left"/>
+      <w:pPr>
+        <w:tabs>
+          <w:tab w:val="num" w:pos="6480"/>
+        </w:tabs>
+        <w:ind w:left="6480" w:hanging="360"/>
+      </w:pPr>
+      <w:rPr>
+        <w:rFonts w:ascii="Wingdings" w:hAnsi="Wingdings" w:hint="default"/>
+        <w:sz w:val="20"/>
+      </w:rPr>
+    </w:lvl>
+  </w:abstractNum>
+  <w:num w:numId="1">
+    <w:abstractNumId w:val="3"/>
+  </w:num>
+  <w:num w:numId="2">
+    <w:abstractNumId w:val="0"/>
+  </w:num>
+  <w:num w:numId="3">
+    <w:abstractNumId w:val="1"/>
+  </w:num>
+  <w:num w:numId="4">
+    <w:abstractNumId w:val="2"/>
+  </w:num>
+</w:numbering>
 </file>
 
 <file path=word/styles.xml><?xml version="1.0" encoding="utf-8"?>
@@ -663,6 +2016,44 @@
     <w:name w:val="Normal"/>
     <w:qFormat/>
   </w:style>
+  <w:style w:type="paragraph" w:styleId="Heading2">
+    <w:name w:val="heading 2"/>
+    <w:basedOn w:val="Normal"/>
+    <w:link w:val="Heading2Char"/>
+    <w:uiPriority w:val="9"/>
+    <w:qFormat/>
+    <w:rsid w:val="00761231"/>
+    <w:pPr>
+      <w:spacing w:before="100" w:beforeAutospacing="1" w:after="100" w:afterAutospacing="1" w:line="240" w:lineRule="auto"/>
+      <w:outlineLvl w:val="1"/>
+    </w:pPr>
+    <w:rPr>
+      <w:rFonts w:ascii="Times New Roman" w:eastAsia="Times New Roman" w:hAnsi="Times New Roman" w:cs="Times New Roman"/>
+      <w:b/>
+      <w:bCs/>
+      <w:sz w:val="36"/>
+      <w:szCs w:val="36"/>
+    </w:rPr>
+  </w:style>
+  <w:style w:type="paragraph" w:styleId="Heading3">
+    <w:name w:val="heading 3"/>
+    <w:basedOn w:val="Normal"/>
+    <w:link w:val="Heading3Char"/>
+    <w:uiPriority w:val="9"/>
+    <w:qFormat/>
+    <w:rsid w:val="00761231"/>
+    <w:pPr>
+      <w:spacing w:before="100" w:beforeAutospacing="1" w:after="100" w:afterAutospacing="1" w:line="240" w:lineRule="auto"/>
+      <w:outlineLvl w:val="2"/>
+    </w:pPr>
+    <w:rPr>
+      <w:rFonts w:ascii="Times New Roman" w:eastAsia="Times New Roman" w:hAnsi="Times New Roman" w:cs="Times New Roman"/>
+      <w:b/>
+      <w:bCs/>
+      <w:sz w:val="27"/>
+      <w:szCs w:val="27"/>
+    </w:rPr>
+  </w:style>
   <w:style w:type="character" w:default="1" w:styleId="DefaultParagraphFont">
     <w:name w:val="Default Paragraph Font"/>
     <w:uiPriority w:val="1"/>
@@ -689,6 +2080,72 @@
     <w:uiPriority w:val="99"/>
     <w:semiHidden/>
     <w:unhideWhenUsed/>
+  </w:style>
+  <w:style w:type="character" w:customStyle="1" w:styleId="Heading2Char">
+    <w:name w:val="Heading 2 Char"/>
+    <w:basedOn w:val="DefaultParagraphFont"/>
+    <w:link w:val="Heading2"/>
+    <w:uiPriority w:val="9"/>
+    <w:rsid w:val="00761231"/>
+    <w:rPr>
+      <w:rFonts w:ascii="Times New Roman" w:eastAsia="Times New Roman" w:hAnsi="Times New Roman" w:cs="Times New Roman"/>
+      <w:b/>
+      <w:bCs/>
+      <w:sz w:val="36"/>
+      <w:szCs w:val="36"/>
+    </w:rPr>
+  </w:style>
+  <w:style w:type="character" w:customStyle="1" w:styleId="Heading3Char">
+    <w:name w:val="Heading 3 Char"/>
+    <w:basedOn w:val="DefaultParagraphFont"/>
+    <w:link w:val="Heading3"/>
+    <w:uiPriority w:val="9"/>
+    <w:rsid w:val="00761231"/>
+    <w:rPr>
+      <w:rFonts w:ascii="Times New Roman" w:eastAsia="Times New Roman" w:hAnsi="Times New Roman" w:cs="Times New Roman"/>
+      <w:b/>
+      <w:bCs/>
+      <w:sz w:val="27"/>
+      <w:szCs w:val="27"/>
+    </w:rPr>
+  </w:style>
+  <w:style w:type="paragraph" w:styleId="NormalWeb">
+    <w:name w:val="Normal (Web)"/>
+    <w:basedOn w:val="Normal"/>
+    <w:uiPriority w:val="99"/>
+    <w:semiHidden/>
+    <w:unhideWhenUsed/>
+    <w:rsid w:val="00761231"/>
+    <w:pPr>
+      <w:spacing w:before="100" w:beforeAutospacing="1" w:after="100" w:afterAutospacing="1" w:line="240" w:lineRule="auto"/>
+    </w:pPr>
+    <w:rPr>
+      <w:rFonts w:ascii="Times New Roman" w:eastAsia="Times New Roman" w:hAnsi="Times New Roman" w:cs="Times New Roman"/>
+      <w:sz w:val="24"/>
+      <w:szCs w:val="24"/>
+    </w:rPr>
+  </w:style>
+  <w:style w:type="character" w:styleId="Strong">
+    <w:name w:val="Strong"/>
+    <w:basedOn w:val="DefaultParagraphFont"/>
+    <w:uiPriority w:val="22"/>
+    <w:qFormat/>
+    <w:rsid w:val="00761231"/>
+    <w:rPr>
+      <w:b/>
+      <w:bCs/>
+    </w:rPr>
+  </w:style>
+  <w:style w:type="character" w:styleId="Emphasis">
+    <w:name w:val="Emphasis"/>
+    <w:basedOn w:val="DefaultParagraphFont"/>
+    <w:uiPriority w:val="20"/>
+    <w:qFormat/>
+    <w:rsid w:val="00761231"/>
+    <w:rPr>
+      <w:i/>
+      <w:iCs/>
+    </w:rPr>
   </w:style>
 </w:styles>
 </file>

</xml_diff>